<commit_message>
render informacao 1 to docx ok
</commit_message>
<xml_diff>
--- a/code/templates/TML_Informacao_pandoc.docx
+++ b/code/templates/TML_Informacao_pandoc.docx
@@ -10161,14 +10161,14 @@
     <w:basedOn w:val="Normal"/>
     <w:qFormat/>
     <w:pPr>
-      <w:spacing w:before="0" w:after="0" w:line="240" w:lineRule="auto"/>
-      <w:ind w:right="0"/>
-      <w:jc w:val="left"/>
+      <w:spacing w:before="40" w:after="40" w:line="260" w:lineRule="auto"/>
+      <w:ind w:right="-7"/>
+      <w:jc w:val="both"/>
     </w:pPr>
     <w:rPr>
-      <w:rFonts w:ascii="Calibri" w:hAnsi="Calibri" w:cs="Calibri"/>
-      <w:sz w:val="17"/>
-      <w:szCs w:val="17"/>
+      <w:rFonts w:ascii="Greycliff CF Light" w:hAnsi="Greycliff CF Light"/>
+      <w:sz w:val="22"/>
+      <w:szCs w:val="22"/>
       <w:lang w:val="pt-PT"/>
     </w:rPr>
   </w:style>
@@ -10276,11 +10276,11 @@
     <w:basedOn w:val="Normal"/>
     <w:qFormat/>
     <w:pPr>
-      <w:spacing w:before="0" w:after="80" w:line="240" w:lineRule="auto"/>
+      <w:spacing w:before="0" w:after="30" w:line="240" w:lineRule="auto"/>
       <w:jc w:val="left"/>
     </w:pPr>
     <w:rPr>
-      <w:rFonts w:ascii="Greycliff CF Light" w:hAnsi="Greycliff CF Light"/>
+      <w:rFonts w:ascii="Greycliff CF Light" w:hAnsi="Greycliff CF Light" w:cs="Greycliff CF Light"/>
       <w:sz w:val="18"/>
       <w:szCs w:val="18"/>
     </w:rPr>
@@ -10296,7 +10296,7 @@
       <w:jc w:val="left"/>
     </w:pPr>
     <w:rPr>
-      <w:rFonts w:ascii="Greycliff CF Light" w:hAnsi="Greycliff CF Light"/>
+      <w:rFonts w:ascii="Greycliff CF Light" w:hAnsi="Greycliff CF Light" w:cs="Greycliff CF Light"/>
       <w:sz w:val="18"/>
       <w:szCs w:val="18"/>
     </w:rPr>
@@ -10422,9 +10422,9 @@
         <w:insideH w:val="none"/>
       </w:tblBorders>
       <w:tblCellMar>
-        <w:top w:w="70" w:type="dxa"/>
+        <w:top w:w="65" w:type="dxa"/>
         <w:left w:w="70" w:type="dxa"/>
-        <w:bottom w:w="70" w:type="dxa"/>
+        <w:bottom w:w="65" w:type="dxa"/>
         <w:right w:w="70" w:type="dxa"/>
       </w:tblCellMar>
     </w:tblPr>

</xml_diff>

<commit_message>
remove bold in caption fonts docx
</commit_message>
<xml_diff>
--- a/code/templates/TML_Informacao_pandoc.docx
+++ b/code/templates/TML_Informacao_pandoc.docx
@@ -10183,8 +10183,6 @@
     </w:pPr>
     <w:rPr>
       <w:rFonts w:ascii="Greycliff CF" w:hAnsi="Greycliff CF"/>
-      <w:b/>
-      <w:bCs/>
       <w:sz w:val="18"/>
       <w:szCs w:val="18"/>
     </w:rPr>
@@ -10200,8 +10198,6 @@
     </w:pPr>
     <w:rPr>
       <w:rFonts w:ascii="Greycliff CF" w:hAnsi="Greycliff CF"/>
-      <w:b/>
-      <w:bCs/>
       <w:sz w:val="18"/>
       <w:szCs w:val="18"/>
     </w:rPr>
@@ -10217,8 +10213,6 @@
     </w:pPr>
     <w:rPr>
       <w:rFonts w:ascii="Greycliff CF" w:hAnsi="Greycliff CF"/>
-      <w:b/>
-      <w:bCs/>
       <w:sz w:val="18"/>
       <w:szCs w:val="18"/>
     </w:rPr>

</xml_diff>

<commit_message>
update templates docx to allow copy paste with TML slyes - avoid conflit with same names
</commit_message>
<xml_diff>
--- a/code/templates/TML_Informacao_pandoc.docx
+++ b/code/templates/TML_Informacao_pandoc.docx
@@ -8079,11 +8079,17 @@
       </w:r>
     </w:p>
     <w:sectPr>
-      <w:pgSz w:w="11900" w:h="16820"/>
-      <w:pgMar w:top="2268" w:right="1701" w:bottom="1701" w:left="1701" w:header="720" w:footer="720" w:gutter="0"/>
-      <w:pgNumType w:start="1"/>
-      <w:cols w:space="720"/>
-      <w:docGrid w:linePitch="299"/>
+      <w:headerReference w:type="even" r:id="rIdHdr1"/>
+      <w:headerReference w:type="default" r:id="rIdHdr2"/>
+      <w:footerReference w:type="even" r:id="rIdFtr1"/>
+      <w:footerReference w:type="default" r:id="rIdFtr2"/>
+      <w:headerReference w:type="first" r:id="rIdHdr3"/>
+      <w:footerReference w:type="first" r:id="rIdFtr3"/>
+      <w:pgSz w:w="11906" w:h="16838"/>
+      <w:pgMar w:top="2410" w:right="1701" w:bottom="1417" w:left="1701" w:header="708" w:footer="708" w:gutter="0"/>
+      <w:pgNumType w:fmt="upperRoman"/>
+      <w:cols w:space="708"/>
+      <w:docGrid w:linePitch="360"/>
     </w:sectPr>
   </w:body>
 </w:document>
@@ -8108,6 +8114,73 @@
 </w:endnotes>
 </file>
 
+<file path=word/footer1.xml><?xml version="1.0" encoding="utf-8"?>
+<w:ftr xmlns:wpc="http://schemas.microsoft.com/office/word/2010/wordprocessingCanvas" xmlns:cx="http://schemas.microsoft.com/office/drawing/2014/chartex" xmlns:cx1="http://schemas.microsoft.com/office/drawing/2015/9/8/chartex" xmlns:cx2="http://schemas.microsoft.com/office/drawing/2015/10/21/chartex" xmlns:cx3="http://schemas.microsoft.com/office/drawing/2016/5/9/chartex" xmlns:cx4="http://schemas.microsoft.com/office/drawing/2016/5/10/chartex" xmlns:cx5="http://schemas.microsoft.com/office/drawing/2016/5/11/chartex" xmlns:cx6="http://schemas.microsoft.com/office/drawing/2016/5/12/chartex" xmlns:cx7="http://schemas.microsoft.com/office/drawing/2016/5/13/chartex" xmlns:cx8="http://schemas.microsoft.com/office/drawing/2016/5/14/chartex" xmlns:mc="http://schemas.openxmlformats.org/markup-compatibility/2006" xmlns:aink="http://schemas.microsoft.com/office/drawing/2016/ink" xmlns:am3d="http://schemas.microsoft.com/office/drawing/2017/model3d" xmlns:o="urn:schemas-microsoft-com:office:office" xmlns:oel="http://schemas.microsoft.com/office/2019/extlst" xmlns:r="http://schemas.openxmlformats.org/officeDocument/2006/relationships" xmlns:m="http://schemas.openxmlformats.org/officeDocument/2006/math" xmlns:v="urn:schemas-microsoft-com:vml" xmlns:wp14="http://schemas.microsoft.com/office/word/2010/wordprocessingDrawing" xmlns:wp="http://schemas.openxmlformats.org/drawingml/2006/wordprocessingDrawing" xmlns:w10="urn:schemas-microsoft-com:office:word" xmlns:w="http://schemas.openxmlformats.org/wordprocessingml/2006/main" xmlns:w14="http://schemas.microsoft.com/office/word/2010/wordml" xmlns:w15="http://schemas.microsoft.com/office/word/2012/wordml" xmlns:w16cex="http://schemas.microsoft.com/office/word/2018/wordml/cex" xmlns:w16cid="http://schemas.microsoft.com/office/word/2016/wordml/cid" xmlns:w16="http://schemas.microsoft.com/office/word/2018/wordml" xmlns:w16du="http://schemas.microsoft.com/office/word/2023/wordml/word16du" xmlns:w16sdtdh="http://schemas.microsoft.com/office/word/2020/wordml/sdtdatahash" xmlns:w16sdtfl="http://schemas.microsoft.com/office/word/2024/wordml/sdtformatlock" xmlns:w16se="http://schemas.microsoft.com/office/word/2015/wordml/symex" xmlns:wpg="http://schemas.microsoft.com/office/word/2010/wordprocessingGroup" xmlns:wpi="http://schemas.microsoft.com/office/word/2010/wordprocessingInk" xmlns:wne="http://schemas.microsoft.com/office/word/2006/wordml" xmlns:wps="http://schemas.microsoft.com/office/word/2010/wordprocessingShape" mc:Ignorable="w14 w15 w16se w16cid w16 w16cex w16sdtdh w16sdtfl w16du wp14">
+  <w:p>
+    <w:pPr>
+      <w:pStyle w:val="Rodap"/>
+    </w:pPr>
+  </w:p>
+</w:ftr>
+</file>
+
+<file path=word/footer2.xml><?xml version="1.0" encoding="utf-8"?>
+<w:ftr xmlns:wpc="http://schemas.microsoft.com/office/word/2010/wordprocessingCanvas" xmlns:cx="http://schemas.microsoft.com/office/drawing/2014/chartex" xmlns:cx1="http://schemas.microsoft.com/office/drawing/2015/9/8/chartex" xmlns:cx2="http://schemas.microsoft.com/office/drawing/2015/10/21/chartex" xmlns:cx3="http://schemas.microsoft.com/office/drawing/2016/5/9/chartex" xmlns:cx4="http://schemas.microsoft.com/office/drawing/2016/5/10/chartex" xmlns:cx5="http://schemas.microsoft.com/office/drawing/2016/5/11/chartex" xmlns:cx6="http://schemas.microsoft.com/office/drawing/2016/5/12/chartex" xmlns:cx7="http://schemas.microsoft.com/office/drawing/2016/5/13/chartex" xmlns:cx8="http://schemas.microsoft.com/office/drawing/2016/5/14/chartex" xmlns:mc="http://schemas.openxmlformats.org/markup-compatibility/2006" xmlns:aink="http://schemas.microsoft.com/office/drawing/2016/ink" xmlns:am3d="http://schemas.microsoft.com/office/drawing/2017/model3d" xmlns:o="urn:schemas-microsoft-com:office:office" xmlns:oel="http://schemas.microsoft.com/office/2019/extlst" xmlns:r="http://schemas.openxmlformats.org/officeDocument/2006/relationships" xmlns:m="http://schemas.openxmlformats.org/officeDocument/2006/math" xmlns:v="urn:schemas-microsoft-com:vml" xmlns:wp14="http://schemas.microsoft.com/office/word/2010/wordprocessingDrawing" xmlns:wp="http://schemas.openxmlformats.org/drawingml/2006/wordprocessingDrawing" xmlns:w10="urn:schemas-microsoft-com:office:word" xmlns:w="http://schemas.openxmlformats.org/wordprocessingml/2006/main" xmlns:w14="http://schemas.microsoft.com/office/word/2010/wordml" xmlns:w15="http://schemas.microsoft.com/office/word/2012/wordml" xmlns:w16cex="http://schemas.microsoft.com/office/word/2018/wordml/cex" xmlns:w16cid="http://schemas.microsoft.com/office/word/2016/wordml/cid" xmlns:w16="http://schemas.microsoft.com/office/word/2018/wordml" xmlns:w16du="http://schemas.microsoft.com/office/word/2023/wordml/word16du" xmlns:w16sdtdh="http://schemas.microsoft.com/office/word/2020/wordml/sdtdatahash" xmlns:w16sdtfl="http://schemas.microsoft.com/office/word/2024/wordml/sdtformatlock" xmlns:w16se="http://schemas.microsoft.com/office/word/2015/wordml/symex" xmlns:wpg="http://schemas.microsoft.com/office/word/2010/wordprocessingGroup" xmlns:wpi="http://schemas.microsoft.com/office/word/2010/wordprocessingInk" xmlns:wne="http://schemas.microsoft.com/office/word/2006/wordml" xmlns:wps="http://schemas.microsoft.com/office/word/2010/wordprocessingShape" mc:Ignorable="w14 w15 w16se w16cid w16 w16cex w16sdtdh w16sdtfl w16du wp14">
+  <w:sdt>
+    <w:sdtPr>
+      <w:id w:val="1307981926"/>
+      <w:docPartObj>
+        <w:docPartGallery w:val="Page Numbers (Bottom of Page)"/>
+        <w:docPartUnique/>
+      </w:docPartObj>
+    </w:sdtPr>
+    <w:sdtContent>
+      <w:p>
+        <w:pPr>
+          <w:pStyle w:val="Rodap"/>
+          <w:jc w:val="right"/>
+        </w:pPr>
+        <w:r>
+          <w:fldChar w:fldCharType="begin"/>
+        </w:r>
+        <w:r>
+          <w:instrText>PAGE   \* MERGEFORMAT</w:instrText>
+        </w:r>
+        <w:r>
+          <w:fldChar w:fldCharType="separate"/>
+        </w:r>
+        <w:r>
+          <w:t>2</w:t>
+        </w:r>
+        <w:r>
+          <w:fldChar w:fldCharType="end"/>
+        </w:r>
+      </w:p>
+    </w:sdtContent>
+  </w:sdt>
+  <w:p>
+    <w:pPr>
+      <w:spacing w:after="0"/>
+      <w:rPr>
+        <w:rFonts w:ascii="greycliff-cf-light" w:hAnsi="greycliff-cf-light"/>
+        <w:sz w:val="18"/>
+        <w:szCs w:val="18"/>
+      </w:rPr>
+    </w:pPr>
+  </w:p>
+</w:ftr>
+</file>
+
+<file path=word/footer3.xml><?xml version="1.0" encoding="utf-8"?>
+<w:ftr xmlns:wpc="http://schemas.microsoft.com/office/word/2010/wordprocessingCanvas" xmlns:cx="http://schemas.microsoft.com/office/drawing/2014/chartex" xmlns:cx1="http://schemas.microsoft.com/office/drawing/2015/9/8/chartex" xmlns:cx2="http://schemas.microsoft.com/office/drawing/2015/10/21/chartex" xmlns:cx3="http://schemas.microsoft.com/office/drawing/2016/5/9/chartex" xmlns:cx4="http://schemas.microsoft.com/office/drawing/2016/5/10/chartex" xmlns:cx5="http://schemas.microsoft.com/office/drawing/2016/5/11/chartex" xmlns:cx6="http://schemas.microsoft.com/office/drawing/2016/5/12/chartex" xmlns:cx7="http://schemas.microsoft.com/office/drawing/2016/5/13/chartex" xmlns:cx8="http://schemas.microsoft.com/office/drawing/2016/5/14/chartex" xmlns:mc="http://schemas.openxmlformats.org/markup-compatibility/2006" xmlns:aink="http://schemas.microsoft.com/office/drawing/2016/ink" xmlns:am3d="http://schemas.microsoft.com/office/drawing/2017/model3d" xmlns:o="urn:schemas-microsoft-com:office:office" xmlns:oel="http://schemas.microsoft.com/office/2019/extlst" xmlns:r="http://schemas.openxmlformats.org/officeDocument/2006/relationships" xmlns:m="http://schemas.openxmlformats.org/officeDocument/2006/math" xmlns:v="urn:schemas-microsoft-com:vml" xmlns:wp14="http://schemas.microsoft.com/office/word/2010/wordprocessingDrawing" xmlns:wp="http://schemas.openxmlformats.org/drawingml/2006/wordprocessingDrawing" xmlns:w10="urn:schemas-microsoft-com:office:word" xmlns:w="http://schemas.openxmlformats.org/wordprocessingml/2006/main" xmlns:w14="http://schemas.microsoft.com/office/word/2010/wordml" xmlns:w15="http://schemas.microsoft.com/office/word/2012/wordml" xmlns:w16cex="http://schemas.microsoft.com/office/word/2018/wordml/cex" xmlns:w16cid="http://schemas.microsoft.com/office/word/2016/wordml/cid" xmlns:w16="http://schemas.microsoft.com/office/word/2018/wordml" xmlns:w16du="http://schemas.microsoft.com/office/word/2023/wordml/word16du" xmlns:w16sdtdh="http://schemas.microsoft.com/office/word/2020/wordml/sdtdatahash" xmlns:w16sdtfl="http://schemas.microsoft.com/office/word/2024/wordml/sdtformatlock" xmlns:w16se="http://schemas.microsoft.com/office/word/2015/wordml/symex" xmlns:wpg="http://schemas.microsoft.com/office/word/2010/wordprocessingGroup" xmlns:wpi="http://schemas.microsoft.com/office/word/2010/wordprocessingInk" xmlns:wne="http://schemas.microsoft.com/office/word/2006/wordml" xmlns:wps="http://schemas.microsoft.com/office/word/2010/wordprocessingShape" mc:Ignorable="w14 w15 w16se w16cid w16 w16cex w16sdtdh w16sdtfl w16du wp14">
+  <w:p>
+    <w:pPr>
+      <w:pStyle w:val="Rodap"/>
+    </w:pPr>
+  </w:p>
+</w:ftr>
+</file>
+
 <file path=word/footnotes.xml><?xml version="1.0" encoding="utf-8"?>
 <w:footnotes xmlns:wpc="http://schemas.microsoft.com/office/word/2010/wordprocessingCanvas" xmlns:cx="http://schemas.microsoft.com/office/drawing/2014/chartex" xmlns:cx1="http://schemas.microsoft.com/office/drawing/2015/9/8/chartex" xmlns:cx2="http://schemas.microsoft.com/office/drawing/2015/10/21/chartex" xmlns:cx3="http://schemas.microsoft.com/office/drawing/2016/5/9/chartex" xmlns:cx4="http://schemas.microsoft.com/office/drawing/2016/5/10/chartex" xmlns:cx5="http://schemas.microsoft.com/office/drawing/2016/5/11/chartex" xmlns:cx6="http://schemas.microsoft.com/office/drawing/2016/5/12/chartex" xmlns:cx7="http://schemas.microsoft.com/office/drawing/2016/5/13/chartex" xmlns:cx8="http://schemas.microsoft.com/office/drawing/2016/5/14/chartex" xmlns:mc="http://schemas.openxmlformats.org/markup-compatibility/2006" xmlns:aink="http://schemas.microsoft.com/office/drawing/2016/ink" xmlns:am3d="http://schemas.microsoft.com/office/drawing/2017/model3d" xmlns:o="urn:schemas-microsoft-com:office:office" xmlns:oel="http://schemas.microsoft.com/office/2019/extlst" xmlns:r="http://schemas.openxmlformats.org/officeDocument/2006/relationships" xmlns:m="http://schemas.openxmlformats.org/officeDocument/2006/math" xmlns:v="urn:schemas-microsoft-com:vml" xmlns:wp14="http://schemas.microsoft.com/office/word/2010/wordprocessingDrawing" xmlns:wp="http://schemas.openxmlformats.org/drawingml/2006/wordprocessingDrawing" xmlns:w10="urn:schemas-microsoft-com:office:word" xmlns:w="http://schemas.openxmlformats.org/wordprocessingml/2006/main" xmlns:w14="http://schemas.microsoft.com/office/word/2010/wordml" xmlns:w15="http://schemas.microsoft.com/office/word/2012/wordml" xmlns:w16cex="http://schemas.microsoft.com/office/word/2018/wordml/cex" xmlns:w16cid="http://schemas.microsoft.com/office/word/2016/wordml/cid" xmlns:w16="http://schemas.microsoft.com/office/word/2018/wordml" xmlns:w16du="http://schemas.microsoft.com/office/word/2023/wordml/word16du" xmlns:w16sdtdh="http://schemas.microsoft.com/office/word/2020/wordml/sdtdatahash" xmlns:w16sdtfl="http://schemas.microsoft.com/office/word/2024/wordml/sdtformatlock" xmlns:w16se="http://schemas.microsoft.com/office/word/2015/wordml/symex" xmlns:wpg="http://schemas.microsoft.com/office/word/2010/wordprocessingGroup" xmlns:wpi="http://schemas.microsoft.com/office/word/2010/wordprocessingInk" xmlns:wne="http://schemas.microsoft.com/office/word/2006/wordml" xmlns:wps="http://schemas.microsoft.com/office/word/2010/wordprocessingShape" mc:Ignorable="w14 w15 w16se w16cid w16 w16cex w16sdtdh w16sdtfl w16du wp14">
   <w:footnote w:type="separator" w:id="-1">
@@ -8125,6 +8198,105 @@
     </w:p>
   </w:footnote>
 </w:footnotes>
+</file>
+
+<file path=word/header1.xml><?xml version="1.0" encoding="utf-8"?>
+<w:hdr xmlns:wpc="http://schemas.microsoft.com/office/word/2010/wordprocessingCanvas" xmlns:cx="http://schemas.microsoft.com/office/drawing/2014/chartex" xmlns:cx1="http://schemas.microsoft.com/office/drawing/2015/9/8/chartex" xmlns:cx2="http://schemas.microsoft.com/office/drawing/2015/10/21/chartex" xmlns:cx3="http://schemas.microsoft.com/office/drawing/2016/5/9/chartex" xmlns:cx4="http://schemas.microsoft.com/office/drawing/2016/5/10/chartex" xmlns:cx5="http://schemas.microsoft.com/office/drawing/2016/5/11/chartex" xmlns:cx6="http://schemas.microsoft.com/office/drawing/2016/5/12/chartex" xmlns:cx7="http://schemas.microsoft.com/office/drawing/2016/5/13/chartex" xmlns:cx8="http://schemas.microsoft.com/office/drawing/2016/5/14/chartex" xmlns:mc="http://schemas.openxmlformats.org/markup-compatibility/2006" xmlns:aink="http://schemas.microsoft.com/office/drawing/2016/ink" xmlns:am3d="http://schemas.microsoft.com/office/drawing/2017/model3d" xmlns:o="urn:schemas-microsoft-com:office:office" xmlns:oel="http://schemas.microsoft.com/office/2019/extlst" xmlns:r="http://schemas.openxmlformats.org/officeDocument/2006/relationships" xmlns:m="http://schemas.openxmlformats.org/officeDocument/2006/math" xmlns:v="urn:schemas-microsoft-com:vml" xmlns:wp14="http://schemas.microsoft.com/office/word/2010/wordprocessingDrawing" xmlns:wp="http://schemas.openxmlformats.org/drawingml/2006/wordprocessingDrawing" xmlns:w10="urn:schemas-microsoft-com:office:word" xmlns:w="http://schemas.openxmlformats.org/wordprocessingml/2006/main" xmlns:w14="http://schemas.microsoft.com/office/word/2010/wordml" xmlns:w15="http://schemas.microsoft.com/office/word/2012/wordml" xmlns:w16cex="http://schemas.microsoft.com/office/word/2018/wordml/cex" xmlns:w16cid="http://schemas.microsoft.com/office/word/2016/wordml/cid" xmlns:w16="http://schemas.microsoft.com/office/word/2018/wordml" xmlns:w16du="http://schemas.microsoft.com/office/word/2023/wordml/word16du" xmlns:w16sdtdh="http://schemas.microsoft.com/office/word/2020/wordml/sdtdatahash" xmlns:w16sdtfl="http://schemas.microsoft.com/office/word/2024/wordml/sdtformatlock" xmlns:w16se="http://schemas.microsoft.com/office/word/2015/wordml/symex" xmlns:wpg="http://schemas.microsoft.com/office/word/2010/wordprocessingGroup" xmlns:wpi="http://schemas.microsoft.com/office/word/2010/wordprocessingInk" xmlns:wne="http://schemas.microsoft.com/office/word/2006/wordml" xmlns:wps="http://schemas.microsoft.com/office/word/2010/wordprocessingShape" mc:Ignorable="w14 w15 w16se w16cid w16 w16cex w16sdtdh w16sdtfl w16du wp14">
+  <w:p>
+    <w:pPr>
+      <w:pStyle w:val="Cabealho"/>
+    </w:pPr>
+  </w:p>
+</w:hdr>
+</file>
+
+<file path=word/header2.xml><?xml version="1.0" encoding="utf-8"?>
+<w:hdr xmlns:wpc="http://schemas.microsoft.com/office/word/2010/wordprocessingCanvas" xmlns:cx="http://schemas.microsoft.com/office/drawing/2014/chartex" xmlns:cx1="http://schemas.microsoft.com/office/drawing/2015/9/8/chartex" xmlns:cx2="http://schemas.microsoft.com/office/drawing/2015/10/21/chartex" xmlns:cx3="http://schemas.microsoft.com/office/drawing/2016/5/9/chartex" xmlns:cx4="http://schemas.microsoft.com/office/drawing/2016/5/10/chartex" xmlns:cx5="http://schemas.microsoft.com/office/drawing/2016/5/11/chartex" xmlns:cx6="http://schemas.microsoft.com/office/drawing/2016/5/12/chartex" xmlns:cx7="http://schemas.microsoft.com/office/drawing/2016/5/13/chartex" xmlns:cx8="http://schemas.microsoft.com/office/drawing/2016/5/14/chartex" xmlns:mc="http://schemas.openxmlformats.org/markup-compatibility/2006" xmlns:aink="http://schemas.microsoft.com/office/drawing/2016/ink" xmlns:am3d="http://schemas.microsoft.com/office/drawing/2017/model3d" xmlns:o="urn:schemas-microsoft-com:office:office" xmlns:oel="http://schemas.microsoft.com/office/2019/extlst" xmlns:r="http://schemas.openxmlformats.org/officeDocument/2006/relationships" xmlns:m="http://schemas.openxmlformats.org/officeDocument/2006/math" xmlns:v="urn:schemas-microsoft-com:vml" xmlns:wp14="http://schemas.microsoft.com/office/word/2010/wordprocessingDrawing" xmlns:wp="http://schemas.openxmlformats.org/drawingml/2006/wordprocessingDrawing" xmlns:w10="urn:schemas-microsoft-com:office:word" xmlns:w="http://schemas.openxmlformats.org/wordprocessingml/2006/main" xmlns:w14="http://schemas.microsoft.com/office/word/2010/wordml" xmlns:w15="http://schemas.microsoft.com/office/word/2012/wordml" xmlns:w16cex="http://schemas.microsoft.com/office/word/2018/wordml/cex" xmlns:w16cid="http://schemas.microsoft.com/office/word/2016/wordml/cid" xmlns:w16="http://schemas.microsoft.com/office/word/2018/wordml" xmlns:w16du="http://schemas.microsoft.com/office/word/2023/wordml/word16du" xmlns:w16sdtdh="http://schemas.microsoft.com/office/word/2020/wordml/sdtdatahash" xmlns:w16sdtfl="http://schemas.microsoft.com/office/word/2024/wordml/sdtformatlock" xmlns:w16se="http://schemas.microsoft.com/office/word/2015/wordml/symex" xmlns:wpg="http://schemas.microsoft.com/office/word/2010/wordprocessingGroup" xmlns:wpi="http://schemas.microsoft.com/office/word/2010/wordprocessingInk" xmlns:wne="http://schemas.microsoft.com/office/word/2006/wordml" xmlns:wps="http://schemas.microsoft.com/office/word/2010/wordprocessingShape" mc:Ignorable="w14 w15 w16se w16cid w16 w16cex w16sdtdh w16sdtfl w16du wp14">
+  <w:p>
+    <w:pPr>
+      <w:pStyle w:val="Cabealho"/>
+    </w:pPr>
+    <w:r>
+      <w:rPr>
+        <w:noProof/>
+      </w:rPr>
+      <w:drawing>
+        <wp:anchor distT="0" distB="0" distL="114300" distR="114300" simplePos="0" relativeHeight="251658240" behindDoc="1" locked="0" layoutInCell="1" allowOverlap="1" wp14:anchorId="750066A2" wp14:editId="2B6E3B35">
+          <wp:simplePos x="0" y="0"/>
+          <wp:positionH relativeFrom="column">
+            <wp:posOffset>-797560</wp:posOffset>
+          </wp:positionH>
+          <wp:positionV relativeFrom="paragraph">
+            <wp:posOffset>-456565</wp:posOffset>
+          </wp:positionV>
+          <wp:extent cx="2750820" cy="1320165"/>
+          <wp:effectExtent l="0" t="0" r="0" b="0"/>
+          <wp:wrapNone/>
+          <wp:docPr id="56" name="Imagem 56"/>
+          <wp:cNvGraphicFramePr>
+            <a:graphicFrameLocks xmlns:a="http://schemas.openxmlformats.org/drawingml/2006/main" noChangeAspect="1"/>
+          </wp:cNvGraphicFramePr>
+          <a:graphic xmlns:a="http://schemas.openxmlformats.org/drawingml/2006/main">
+            <a:graphicData uri="http://schemas.openxmlformats.org/drawingml/2006/picture">
+              <pic:pic xmlns:pic="http://schemas.openxmlformats.org/drawingml/2006/picture">
+                <pic:nvPicPr>
+                  <pic:cNvPr id="56" name="Imagem 2"/>
+                  <pic:cNvPicPr/>
+                </pic:nvPicPr>
+                <pic:blipFill>
+                  <a:blip r:embed="rId1">
+                    <a:extLst>
+                      <a:ext uri="{28A0092B-C50C-407E-A947-70E740481C1C}">
+                        <a14:useLocalDpi xmlns:a14="http://schemas.microsoft.com/office/drawing/2010/main" val="0"/>
+                      </a:ext>
+                    </a:extLst>
+                  </a:blip>
+                  <a:srcRect b="9128"/>
+                  <a:stretch>
+                    <a:fillRect/>
+                  </a:stretch>
+                </pic:blipFill>
+                <pic:spPr bwMode="auto">
+                  <a:xfrm>
+                    <a:off x="0" y="0"/>
+                    <a:ext cx="2750820" cy="1320165"/>
+                  </a:xfrm>
+                  <a:prstGeom prst="rect">
+                    <a:avLst/>
+                  </a:prstGeom>
+                  <a:ln>
+                    <a:noFill/>
+                  </a:ln>
+                  <a:extLst>
+                    <a:ext uri="{53640926-AAD7-44D8-BBD7-CCE9431645EC}">
+                      <a14:shadowObscured xmlns:a14="http://schemas.microsoft.com/office/drawing/2010/main"/>
+                    </a:ext>
+                  </a:extLst>
+                </pic:spPr>
+              </pic:pic>
+            </a:graphicData>
+          </a:graphic>
+          <wp14:sizeRelH relativeFrom="margin">
+            <wp14:pctWidth>0</wp14:pctWidth>
+          </wp14:sizeRelH>
+          <wp14:sizeRelV relativeFrom="margin">
+            <wp14:pctHeight>0</wp14:pctHeight>
+          </wp14:sizeRelV>
+        </wp:anchor>
+      </w:drawing>
+    </w:r>
+  </w:p>
+</w:hdr>
+</file>
+
+<file path=word/header3.xml><?xml version="1.0" encoding="utf-8"?>
+<w:hdr xmlns:wpc="http://schemas.microsoft.com/office/word/2010/wordprocessingCanvas" xmlns:cx="http://schemas.microsoft.com/office/drawing/2014/chartex" xmlns:cx1="http://schemas.microsoft.com/office/drawing/2015/9/8/chartex" xmlns:cx2="http://schemas.microsoft.com/office/drawing/2015/10/21/chartex" xmlns:cx3="http://schemas.microsoft.com/office/drawing/2016/5/9/chartex" xmlns:cx4="http://schemas.microsoft.com/office/drawing/2016/5/10/chartex" xmlns:cx5="http://schemas.microsoft.com/office/drawing/2016/5/11/chartex" xmlns:cx6="http://schemas.microsoft.com/office/drawing/2016/5/12/chartex" xmlns:cx7="http://schemas.microsoft.com/office/drawing/2016/5/13/chartex" xmlns:cx8="http://schemas.microsoft.com/office/drawing/2016/5/14/chartex" xmlns:mc="http://schemas.openxmlformats.org/markup-compatibility/2006" xmlns:aink="http://schemas.microsoft.com/office/drawing/2016/ink" xmlns:am3d="http://schemas.microsoft.com/office/drawing/2017/model3d" xmlns:o="urn:schemas-microsoft-com:office:office" xmlns:oel="http://schemas.microsoft.com/office/2019/extlst" xmlns:r="http://schemas.openxmlformats.org/officeDocument/2006/relationships" xmlns:m="http://schemas.openxmlformats.org/officeDocument/2006/math" xmlns:v="urn:schemas-microsoft-com:vml" xmlns:wp14="http://schemas.microsoft.com/office/word/2010/wordprocessingDrawing" xmlns:wp="http://schemas.openxmlformats.org/drawingml/2006/wordprocessingDrawing" xmlns:w10="urn:schemas-microsoft-com:office:word" xmlns:w="http://schemas.openxmlformats.org/wordprocessingml/2006/main" xmlns:w14="http://schemas.microsoft.com/office/word/2010/wordml" xmlns:w15="http://schemas.microsoft.com/office/word/2012/wordml" xmlns:w16cex="http://schemas.microsoft.com/office/word/2018/wordml/cex" xmlns:w16cid="http://schemas.microsoft.com/office/word/2016/wordml/cid" xmlns:w16="http://schemas.microsoft.com/office/word/2018/wordml" xmlns:w16du="http://schemas.microsoft.com/office/word/2023/wordml/word16du" xmlns:w16sdtdh="http://schemas.microsoft.com/office/word/2020/wordml/sdtdatahash" xmlns:w16sdtfl="http://schemas.microsoft.com/office/word/2024/wordml/sdtformatlock" xmlns:w16se="http://schemas.microsoft.com/office/word/2015/wordml/symex" xmlns:wpg="http://schemas.microsoft.com/office/word/2010/wordprocessingGroup" xmlns:wpi="http://schemas.microsoft.com/office/word/2010/wordprocessingInk" xmlns:wne="http://schemas.microsoft.com/office/word/2006/wordml" xmlns:wps="http://schemas.microsoft.com/office/word/2010/wordprocessingShape" mc:Ignorable="w14 w15 w16se w16cid w16 w16cex w16sdtdh w16sdtfl w16du wp14">
+  <w:p>
+    <w:pPr>
+      <w:pStyle w:val="Cabealho"/>
+    </w:pPr>
+  </w:p>
+</w:hdr>
 </file>
 
 <file path=word/numbering.xml><?xml version="1.0" encoding="utf-8"?>
@@ -8794,41 +8966,57 @@
     <w:lvl w:ilvl="0">
       <w:start w:val="1"/>
       <w:numFmt w:val="decimal"/>
-      <w:pStyle w:val="Ttulo1"/>
+      <w:pStyle w:val="TMLTitulo1"/>
       <w:lvlText w:val="%1."/>
       <w:lvlJc w:val="left"/>
       <w:pPr>
-        <w:ind w:left="720" w:hanging="360"/>
-      </w:pPr>
+        <w:ind w:left="426" w:hanging="426"/>
+      </w:pPr>
+      <w:rPr>
+        <w:rFonts w:ascii="Greycliff CF" w:hAnsi="Greycliff CF" w:cs="Greycliff CF" w:hint="default"/>
+        <w:b/>
+        <w:bCs/>
+        <w:color w:val="000000"/>
+        <w:sz w:val="28"/>
+        <w:szCs w:val="32"/>
+      </w:rPr>
     </w:lvl>
     <w:lvl w:ilvl="1">
       <w:start w:val="1"/>
       <w:numFmt w:val="decimal"/>
-      <w:pStyle w:val="Ttulo2"/>
+      <w:pStyle w:val="TMLTitulo2"/>
       <w:isLgl/>
       <w:lvlText w:val="%1.%2."/>
       <w:lvlJc w:val="left"/>
       <w:pPr>
-        <w:ind w:left="1080" w:hanging="720"/>
+        <w:ind w:left="567" w:hanging="567"/>
       </w:pPr>
       <w:rPr>
-        <w:rFonts w:eastAsiaTheme="majorEastAsia" w:cstheme="majorBidi" w:hint="default"/>
+        <w:rFonts w:ascii="Greycliff CF" w:hAnsi="Greycliff CF" w:cs="Greycliff CF" w:hint="default"/>
+        <w:b/>
+        <w:bCs/>
         <w:color w:val="000000"/>
+        <w:sz w:val="24"/>
+        <w:szCs w:val="28"/>
       </w:rPr>
     </w:lvl>
     <w:lvl w:ilvl="2">
       <w:start w:val="1"/>
       <w:numFmt w:val="decimal"/>
-      <w:pStyle w:val="Ttulo3"/>
+      <w:pStyle w:val="TMLTitulo3"/>
       <w:isLgl/>
       <w:lvlText w:val="%1.%2.%3."/>
       <w:lvlJc w:val="left"/>
       <w:pPr>
-        <w:ind w:left="1080" w:hanging="720"/>
+        <w:ind w:left="567" w:hanging="567"/>
       </w:pPr>
       <w:rPr>
-        <w:rFonts w:eastAsiaTheme="majorEastAsia" w:cstheme="majorBidi" w:hint="default"/>
+        <w:rFonts w:ascii="Greycliff CF" w:hAnsi="Greycliff CF" w:cs="Greycliff CF" w:hint="default"/>
+        <w:b/>
+        <w:bCs/>
         <w:color w:val="000000"/>
+        <w:sz w:val="22"/>
+        <w:szCs w:val="22"/>
       </w:rPr>
     </w:lvl>
     <w:lvl w:ilvl="3">
@@ -8841,7 +9029,6 @@
         <w:ind w:left="1440" w:hanging="1080"/>
       </w:pPr>
       <w:rPr>
-        <w:rFonts w:eastAsiaTheme="majorEastAsia" w:cstheme="majorBidi" w:hint="default"/>
         <w:color w:val="000000"/>
       </w:rPr>
     </w:lvl>
@@ -8855,7 +9042,6 @@
         <w:ind w:left="1440" w:hanging="1080"/>
       </w:pPr>
       <w:rPr>
-        <w:rFonts w:eastAsiaTheme="majorEastAsia" w:cstheme="majorBidi" w:hint="default"/>
         <w:color w:val="000000"/>
       </w:rPr>
     </w:lvl>
@@ -8869,7 +9055,6 @@
         <w:ind w:left="1800" w:hanging="1440"/>
       </w:pPr>
       <w:rPr>
-        <w:rFonts w:eastAsiaTheme="majorEastAsia" w:cstheme="majorBidi" w:hint="default"/>
         <w:color w:val="000000"/>
       </w:rPr>
     </w:lvl>
@@ -8883,7 +9068,6 @@
         <w:ind w:left="1800" w:hanging="1440"/>
       </w:pPr>
       <w:rPr>
-        <w:rFonts w:eastAsiaTheme="majorEastAsia" w:cstheme="majorBidi" w:hint="default"/>
         <w:color w:val="000000"/>
       </w:rPr>
     </w:lvl>
@@ -8897,7 +9081,6 @@
         <w:ind w:left="2160" w:hanging="1800"/>
       </w:pPr>
       <w:rPr>
-        <w:rFonts w:eastAsiaTheme="majorEastAsia" w:cstheme="majorBidi" w:hint="default"/>
         <w:color w:val="000000"/>
       </w:rPr>
     </w:lvl>
@@ -8911,7 +9094,6 @@
         <w:ind w:left="2160" w:hanging="1800"/>
       </w:pPr>
       <w:rPr>
-        <w:rFonts w:eastAsiaTheme="majorEastAsia" w:cstheme="majorBidi" w:hint="default"/>
         <w:color w:val="000000"/>
       </w:rPr>
     </w:lvl>
@@ -9221,14 +9403,17 @@
     <w:tmpl w:val="D638C2E4"/>
     <w:lvl w:ilvl="0" w:tplc="380EC0A8">
       <w:numFmt w:val="bullet"/>
-      <w:pStyle w:val="PargrafodaLista"/>
+      <w:pStyle w:val="TMLLista"/>
       <w:lvlText w:val="•"/>
       <w:lvlJc w:val="left"/>
       <w:pPr>
-        <w:ind w:left="720" w:hanging="360"/>
+        <w:ind w:left="360" w:hanging="360"/>
       </w:pPr>
       <w:rPr>
-        <w:rFonts w:ascii="WPAGTD+GreycliffCF-Light-Identi" w:eastAsiaTheme="minorEastAsia" w:hAnsi="WPAGTD+GreycliffCF-Light-Identi" w:cs="WPAGTD+GreycliffCF-Light-Identi" w:hint="default"/>
+        <w:rFonts w:ascii="Greycliff CF Light" w:hAnsi="Greycliff CF Light" w:cs="Greycliff CF Light" w:hint="default"/>
+        <w:color w:val="000000"/>
+        <w:sz w:val="22"/>
+        <w:szCs w:val="22"/>
       </w:rPr>
     </w:lvl>
     <w:lvl w:ilvl="1" w:tplc="08090003" w:tentative="1">
@@ -9379,6 +9564,7 @@
     <w:rPrDefault>
       <w:rPr>
         <w:rFonts w:ascii="Greycliff CF Light" w:hAnsi="Greycliff CF Light" w:eastAsia="Greycliff CF Light" w:cs="Greycliff CF Light"/>
+        <w:color w:val="000000"/>
         <w:sz w:val="22"/>
         <w:szCs w:val="22"/>
         <w:lang w:val="pt-PT"/>
@@ -9387,7 +9573,7 @@
     <w:pPrDefault>
       <w:pPr>
         <w:spacing w:before="120" w:after="240" w:line="288" w:lineRule="auto"/>
-        <w:ind w:right="-7"/>
+        <w:ind w:left="0" w:right="-7"/>
         <w:jc w:val="both"/>
       </w:pPr>
     </w:pPrDefault>
@@ -10124,17 +10310,89 @@
       </w:numPr>
     </w:pPr>
   </w:style>
-  <w:style w:type="paragraph" w:customStyle="1" w:styleId="BodyText">
-    <w:name w:val="Body Text"/>
-    <w:basedOn w:val="Normal"/>
+  <w:style w:type="paragraph" w:customStyle="1" w:styleId="TMLBase">
+    <w:name w:val="TML Base"/>
     <w:qFormat/>
     <w:pPr>
       <w:spacing w:before="120" w:after="240" w:line="288" w:lineRule="auto"/>
+      <w:ind w:left="0" w:right="-7"/>
+      <w:jc w:val="both"/>
+    </w:pPr>
+    <w:rPr>
+      <w:rFonts w:ascii="Greycliff CF Light" w:hAnsi="Greycliff CF Light" w:eastAsia="Greycliff CF Light" w:cs="Greycliff CF Light"/>
+      <w:color w:val="000000"/>
+      <w:sz w:val="22"/>
+      <w:szCs w:val="22"/>
+      <w:lang w:val="pt-PT"/>
+    </w:rPr>
+  </w:style>
+  <w:style w:type="paragraph" w:customStyle="1" w:styleId="TMLCorpo">
+    <w:name w:val="TML Corpo"/>
+    <w:basedOn w:val="TMLBase"/>
+    <w:qFormat/>
+    <w:pPr>
+      <w:spacing w:before="120" w:after="240" w:line="288" w:lineRule="auto"/>
+      <w:ind w:left="0" w:right="-7"/>
+      <w:jc w:val="both"/>
+    </w:pPr>
+    <w:rPr>
+      <w:rFonts w:ascii="Greycliff CF Light" w:hAnsi="Greycliff CF Light" w:eastAsia="Greycliff CF Light" w:cs="Greycliff CF Light"/>
+      <w:color w:val="000000"/>
+      <w:sz w:val="22"/>
+      <w:szCs w:val="22"/>
+      <w:lang w:val="pt-PT"/>
+    </w:rPr>
+  </w:style>
+  <w:style w:type="paragraph" w:customStyle="1" w:styleId="TMLCompacto">
+    <w:name w:val="TML Compacto"/>
+    <w:basedOn w:val="TMLBase"/>
+    <w:qFormat/>
+    <w:pPr>
+      <w:spacing w:before="40" w:after="40" w:line="260" w:lineRule="auto"/>
       <w:ind w:right="-7"/>
       <w:jc w:val="both"/>
     </w:pPr>
     <w:rPr>
-      <w:rFonts w:ascii="Greycliff CF Light" w:hAnsi="Greycliff CF Light"/>
+      <w:rFonts w:ascii="Greycliff CF Light" w:hAnsi="Greycliff CF Light" w:eastAsia="Greycliff CF Light" w:cs="Greycliff CF Light"/>
+      <w:color w:val="000000"/>
+      <w:sz w:val="22"/>
+      <w:szCs w:val="22"/>
+      <w:lang w:val="pt-PT"/>
+    </w:rPr>
+  </w:style>
+  <w:style w:type="paragraph" w:customStyle="1" w:styleId="TMLLista">
+    <w:name w:val="TML Lista"/>
+    <w:basedOn w:val="TMLBase"/>
+    <w:qFormat/>
+    <w:pPr>
+      <w:numPr>
+        <w:ilvl w:val="0"/>
+        <w:numId w:val="4"/>
+      </w:numPr>
+      <w:spacing w:before="40" w:after="40" w:line="260" w:lineRule="auto"/>
+      <w:ind w:left="360" w:hanging="360" w:right="-7"/>
+      <w:jc w:val="both"/>
+    </w:pPr>
+    <w:rPr>
+      <w:rFonts w:ascii="Greycliff CF Light" w:hAnsi="Greycliff CF Light" w:eastAsia="Greycliff CF Light" w:cs="Greycliff CF Light"/>
+      <w:color w:val="000000"/>
+      <w:sz w:val="22"/>
+      <w:szCs w:val="22"/>
+      <w:lang w:val="pt-PT"/>
+    </w:rPr>
+  </w:style>
+  <w:style w:type="paragraph" w:customStyle="1" w:styleId="BodyText">
+    <w:name w:val="Body Text"/>
+    <w:basedOn w:val="TMLBase"/>
+    <w:qFormat/>
+    <w:pPr>
+      <w:spacing w:before="120" w:after="240" w:line="288" w:lineRule="auto"/>
+      <w:ind w:left="0" w:right="-7"/>
+      <w:jc w:val="both"/>
+    </w:pPr>
+    <w:rPr>
+      <w:rFonts w:ascii="Greycliff CF Light" w:hAnsi="Greycliff CF Light" w:eastAsia="Greycliff CF Light" w:cs="Greycliff CF Light"/>
+      <w:color w:val="000000"/>
       <w:sz w:val="22"/>
       <w:szCs w:val="22"/>
       <w:lang w:val="pt-PT"/>
@@ -10142,23 +10400,44 @@
   </w:style>
   <w:style w:type="paragraph" w:customStyle="1" w:styleId="FirstParagraph">
     <w:name w:val="First Paragraph"/>
-    <w:basedOn w:val="Normal"/>
+    <w:basedOn w:val="TMLBase"/>
     <w:qFormat/>
     <w:pPr>
       <w:spacing w:before="120" w:after="240" w:line="288" w:lineRule="auto"/>
-      <w:ind w:right="-7"/>
+      <w:ind w:left="0" w:right="-7"/>
       <w:jc w:val="both"/>
     </w:pPr>
     <w:rPr>
-      <w:rFonts w:ascii="Greycliff CF Light" w:hAnsi="Greycliff CF Light"/>
+      <w:rFonts w:ascii="Greycliff CF Light" w:hAnsi="Greycliff CF Light" w:eastAsia="Greycliff CF Light" w:cs="Greycliff CF Light"/>
+      <w:color w:val="000000"/>
       <w:sz w:val="22"/>
       <w:szCs w:val="22"/>
       <w:lang w:val="pt-PT"/>
     </w:rPr>
   </w:style>
+  <w:style w:type="paragraph" w:customStyle="1" w:styleId="BlockText">
+    <w:name w:val="Block Text"/>
+    <w:basedOn w:val="TMLBase"/>
+    <w:qFormat/>
+    <w:pPr>
+      <w:pBdr>
+        <w:left w:val="single" w:sz="12" w:space="12" w:color="B0B0B0"/>
+      </w:pBdr>
+      <w:spacing w:before="120" w:after="240" w:line="260" w:lineRule="auto"/>
+      <w:ind w:left="720" w:right="360"/>
+      <w:jc w:val="both"/>
+    </w:pPr>
+    <w:rPr>
+      <w:rFonts w:ascii="Greycliff CF Light" w:hAnsi="Greycliff CF Light" w:cs="Greycliff CF Light"/>
+      <w:color w:val="404040"/>
+      <w:sz w:val="21"/>
+      <w:szCs w:val="21"/>
+      <w:lang w:val="pt-PT"/>
+    </w:rPr>
+  </w:style>
   <w:style w:type="paragraph" w:customStyle="1" w:styleId="Compact">
     <w:name w:val="Compact"/>
-    <w:basedOn w:val="Normal"/>
+    <w:basedOn w:val="TMLBase"/>
     <w:qFormat/>
     <w:pPr>
       <w:spacing w:before="40" w:after="40" w:line="260" w:lineRule="auto"/>
@@ -10166,7 +10445,8 @@
       <w:jc w:val="both"/>
     </w:pPr>
     <w:rPr>
-      <w:rFonts w:ascii="Greycliff CF Light" w:hAnsi="Greycliff CF Light"/>
+      <w:rFonts w:ascii="Greycliff CF Light" w:hAnsi="Greycliff CF Light" w:eastAsia="Greycliff CF Light" w:cs="Greycliff CF Light"/>
+      <w:color w:val="000000"/>
       <w:sz w:val="22"/>
       <w:szCs w:val="22"/>
       <w:lang w:val="pt-PT"/>
@@ -10174,60 +10454,67 @@
   </w:style>
   <w:style w:type="paragraph" w:customStyle="1" w:styleId="TableCaption">
     <w:name w:val="Table Caption"/>
-    <w:basedOn w:val="Normal"/>
+    <w:basedOn w:val="TMLBase"/>
     <w:qFormat/>
     <w:pPr>
       <w:keepNext/>
       <w:spacing w:before="140" w:after="80" w:line="240" w:lineRule="auto"/>
+      <w:ind w:left="0" w:right="0"/>
       <w:jc w:val="center"/>
     </w:pPr>
     <w:rPr>
-      <w:rFonts w:ascii="Greycliff CF" w:hAnsi="Greycliff CF"/>
+      <w:rFonts w:ascii="Greycliff CF" w:hAnsi="Greycliff CF" w:cs="Greycliff CF"/>
+      <w:color w:val="000000"/>
       <w:sz w:val="18"/>
       <w:szCs w:val="18"/>
     </w:rPr>
   </w:style>
   <w:style w:type="paragraph" w:customStyle="1" w:styleId="ImageCaption">
     <w:name w:val="Image Caption"/>
-    <w:basedOn w:val="Normal"/>
+    <w:basedOn w:val="TMLBase"/>
     <w:qFormat/>
     <w:pPr>
       <w:keepNext/>
       <w:spacing w:before="140" w:after="80" w:line="240" w:lineRule="auto"/>
+      <w:ind w:left="0" w:right="0"/>
       <w:jc w:val="center"/>
     </w:pPr>
     <w:rPr>
-      <w:rFonts w:ascii="Greycliff CF" w:hAnsi="Greycliff CF"/>
+      <w:rFonts w:ascii="Greycliff CF" w:hAnsi="Greycliff CF" w:cs="Greycliff CF"/>
+      <w:color w:val="000000"/>
       <w:sz w:val="18"/>
       <w:szCs w:val="18"/>
     </w:rPr>
   </w:style>
   <w:style w:type="paragraph" w:customStyle="1" w:styleId="Caption">
     <w:name w:val="Caption"/>
-    <w:basedOn w:val="Normal"/>
+    <w:basedOn w:val="TMLBase"/>
     <w:qFormat/>
     <w:pPr>
       <w:keepNext/>
       <w:spacing w:before="140" w:after="80" w:line="240" w:lineRule="auto"/>
+      <w:ind w:left="0" w:right="0"/>
       <w:jc w:val="center"/>
     </w:pPr>
     <w:rPr>
-      <w:rFonts w:ascii="Greycliff CF" w:hAnsi="Greycliff CF"/>
+      <w:rFonts w:ascii="Greycliff CF" w:hAnsi="Greycliff CF" w:cs="Greycliff CF"/>
+      <w:color w:val="000000"/>
       <w:sz w:val="18"/>
       <w:szCs w:val="18"/>
     </w:rPr>
   </w:style>
   <w:style w:type="paragraph" w:customStyle="1" w:styleId="TabelaTexto">
     <w:name w:val="Tabela Texto"/>
-    <w:basedOn w:val="Normal"/>
+    <w:basedOn w:val="TMLBase"/>
     <w:qFormat/>
     <w:pPr>
       <w:spacing w:before="0" w:after="0" w:line="240" w:lineRule="auto"/>
-      <w:ind w:right="0"/>
+      <w:ind w:left="0" w:right="0"/>
       <w:jc w:val="left"/>
     </w:pPr>
     <w:rPr>
       <w:rFonts w:ascii="Calibri" w:hAnsi="Calibri" w:cs="Calibri"/>
+      <w:color w:val="000000"/>
       <w:sz w:val="17"/>
       <w:szCs w:val="17"/>
       <w:lang w:val="pt-PT"/>
@@ -10235,15 +10522,16 @@
   </w:style>
   <w:style w:type="paragraph" w:customStyle="1" w:styleId="TabelaTextoPequeno">
     <w:name w:val="Tabela Texto Pequeno"/>
-    <w:basedOn w:val="Normal"/>
+    <w:basedOn w:val="TMLBase"/>
     <w:qFormat/>
     <w:pPr>
       <w:spacing w:before="0" w:after="0" w:line="180" w:lineRule="exact"/>
-      <w:ind w:right="0"/>
+      <w:ind w:left="0" w:right="0"/>
       <w:jc w:val="left"/>
     </w:pPr>
     <w:rPr>
       <w:rFonts w:ascii="Calibri" w:hAnsi="Calibri" w:cs="Calibri"/>
+      <w:color w:val="000000"/>
       <w:sz w:val="17"/>
       <w:szCs w:val="17"/>
       <w:lang w:val="pt-PT"/>
@@ -10251,11 +10539,11 @@
   </w:style>
   <w:style w:type="paragraph" w:customStyle="1" w:styleId="TabelaNota">
     <w:name w:val="Tabela Nota"/>
-    <w:basedOn w:val="Normal"/>
+    <w:basedOn w:val="TMLBase"/>
     <w:qFormat/>
     <w:pPr>
-      <w:spacing w:before="60" w:after="180" w:line="240" w:lineRule="auto"/>
-      <w:ind w:right="0"/>
+      <w:spacing w:before="60" w:after="0" w:line="240" w:lineRule="auto"/>
+      <w:ind w:left="0" w:right="0"/>
       <w:jc w:val="left"/>
     </w:pPr>
     <w:rPr>
@@ -10267,21 +10555,23 @@
   </w:style>
   <w:style w:type="paragraph" w:customStyle="1" w:styleId="BlocoPequeno">
     <w:name w:val="Bloco Pequeno"/>
-    <w:basedOn w:val="Normal"/>
+    <w:basedOn w:val="TMLBase"/>
     <w:qFormat/>
     <w:pPr>
       <w:spacing w:before="0" w:after="30" w:line="240" w:lineRule="auto"/>
+      <w:ind w:left="0" w:right="0"/>
       <w:jc w:val="left"/>
     </w:pPr>
     <w:rPr>
       <w:rFonts w:ascii="Greycliff CF Light" w:hAnsi="Greycliff CF Light" w:cs="Greycliff CF Light"/>
+      <w:color w:val="000000"/>
       <w:sz w:val="18"/>
       <w:szCs w:val="18"/>
     </w:rPr>
   </w:style>
   <w:style w:type="paragraph" w:customStyle="1" w:styleId="BlocoDireita">
     <w:name w:val="Bloco Direita"/>
-    <w:basedOn w:val="Normal"/>
+    <w:basedOn w:val="TMLBase"/>
     <w:qFormat/>
     <w:pPr>
       <w:keepLines/>
@@ -10291,13 +10581,14 @@
     </w:pPr>
     <w:rPr>
       <w:rFonts w:ascii="Greycliff CF Light" w:hAnsi="Greycliff CF Light" w:cs="Greycliff CF Light"/>
+      <w:color w:val="000000"/>
       <w:sz w:val="18"/>
       <w:szCs w:val="18"/>
     </w:rPr>
   </w:style>
   <w:style w:type="paragraph" w:customStyle="1" w:styleId="LinhaDespacho">
     <w:name w:val="Linha Despacho"/>
-    <w:basedOn w:val="Normal"/>
+    <w:basedOn w:val="TMLBase"/>
     <w:qFormat/>
     <w:pPr>
       <w:pBdr>
@@ -10305,25 +10596,32 @@
       </w:pBdr>
       <w:spacing w:before="600" w:after="120"/>
     </w:pPr>
-    <w:rPr/>
+    <w:rPr>
+      <w:rFonts w:ascii="Greycliff CF Light" w:hAnsi="Greycliff CF Light" w:eastAsia="Greycliff CF Light" w:cs="Greycliff CF Light"/>
+      <w:color w:val="000000"/>
+      <w:sz w:val="22"/>
+      <w:szCs w:val="22"/>
+      <w:lang w:val="pt-PT"/>
+    </w:rPr>
   </w:style>
   <w:style w:type="paragraph" w:styleId="Heading1">
     <w:name w:val="Heading 1"/>
-    <w:basedOn w:val="Ttulo1"/>
-    <w:next w:val="BodyText"/>
+    <w:basedOn w:val="TMLBase"/>
+    <w:next w:val="TMLCorpo"/>
     <w:qFormat/>
     <w:pPr>
       <w:keepNext/>
       <w:keepLines/>
       <w:numPr>
+        <w:ilvl w:val="0"/>
         <w:numId w:val="5"/>
       </w:numPr>
       <w:spacing w:before="431" w:after="120" w:line="354" w:lineRule="exact"/>
-      <w:ind w:left="426"/>
+      <w:ind w:left="426" w:hanging="426"/>
       <w:outlineLvl w:val="0"/>
     </w:pPr>
     <w:rPr>
-      <w:rFonts w:ascii="Greycliff CF" w:hAnsi="Greycliff CF"/>
+      <w:rFonts w:ascii="Greycliff CF" w:hAnsi="Greycliff CF" w:cs="Greycliff CF"/>
       <w:b/>
       <w:bCs/>
       <w:color w:val="000000"/>
@@ -10334,8 +10632,8 @@
   </w:style>
   <w:style w:type="paragraph" w:styleId="Heading2">
     <w:name w:val="Heading 2"/>
-    <w:basedOn w:val="Ttulo2"/>
-    <w:next w:val="BodyText"/>
+    <w:basedOn w:val="TMLBase"/>
+    <w:next w:val="TMLCorpo"/>
     <w:qFormat/>
     <w:pPr>
       <w:keepNext/>
@@ -10349,17 +10647,18 @@
       <w:outlineLvl w:val="1"/>
     </w:pPr>
     <w:rPr>
-      <w:rFonts w:ascii="Greycliff CF" w:hAnsi="Greycliff CF"/>
+      <w:rFonts w:ascii="Greycliff CF" w:hAnsi="Greycliff CF" w:cs="Greycliff CF"/>
       <w:b/>
       <w:bCs/>
+      <w:color w:val="000000"/>
       <w:sz w:val="24"/>
       <w:szCs w:val="28"/>
     </w:rPr>
   </w:style>
   <w:style w:type="paragraph" w:styleId="Heading3">
     <w:name w:val="Heading 3"/>
-    <w:basedOn w:val="Ttulo3"/>
-    <w:next w:val="BodyText"/>
+    <w:basedOn w:val="TMLBase"/>
+    <w:next w:val="TMLCorpo"/>
     <w:qFormat/>
     <w:pPr>
       <w:keepNext/>
@@ -10373,23 +10672,101 @@
       <w:outlineLvl w:val="2"/>
     </w:pPr>
     <w:rPr>
-      <w:rFonts w:ascii="Greycliff CF" w:hAnsi="Greycliff CF"/>
+      <w:rFonts w:ascii="Greycliff CF" w:hAnsi="Greycliff CF" w:cs="Greycliff CF"/>
       <w:b/>
       <w:bCs/>
+      <w:color w:val="000000"/>
+      <w:sz w:val="22"/>
+      <w:szCs w:val="22"/>
+    </w:rPr>
+  </w:style>
+  <w:style w:type="paragraph" w:customStyle="1" w:styleId="TMLTitulo1">
+    <w:name w:val="TML Titulo 1"/>
+    <w:basedOn w:val="TMLBase"/>
+    <w:next w:val="TMLCorpo"/>
+    <w:qFormat/>
+    <w:pPr>
+      <w:keepNext/>
+      <w:keepLines/>
+      <w:numPr>
+        <w:ilvl w:val="0"/>
+        <w:numId w:val="5"/>
+      </w:numPr>
+      <w:spacing w:before="431" w:after="120" w:line="354" w:lineRule="exact"/>
+      <w:ind w:left="426" w:hanging="426"/>
+      <w:outlineLvl w:val="0"/>
+    </w:pPr>
+    <w:rPr>
+      <w:rFonts w:ascii="Greycliff CF" w:hAnsi="Greycliff CF" w:cs="Greycliff CF"/>
+      <w:b/>
+      <w:bCs/>
+      <w:color w:val="000000"/>
+      <w:spacing w:val="-1"/>
+      <w:sz w:val="28"/>
+      <w:szCs w:val="32"/>
+    </w:rPr>
+  </w:style>
+  <w:style w:type="paragraph" w:customStyle="1" w:styleId="TMLTitulo2">
+    <w:name w:val="TML Titulo 2"/>
+    <w:basedOn w:val="TMLBase"/>
+    <w:next w:val="TMLCorpo"/>
+    <w:qFormat/>
+    <w:pPr>
+      <w:keepNext/>
+      <w:keepLines/>
+      <w:numPr>
+        <w:ilvl w:val="1"/>
+        <w:numId w:val="5"/>
+      </w:numPr>
+      <w:spacing w:before="300" w:after="100"/>
+      <w:ind w:left="567" w:hanging="567"/>
+      <w:outlineLvl w:val="1"/>
+    </w:pPr>
+    <w:rPr>
+      <w:rFonts w:ascii="Greycliff CF" w:hAnsi="Greycliff CF" w:cs="Greycliff CF"/>
+      <w:b/>
+      <w:bCs/>
+      <w:color w:val="000000"/>
+      <w:sz w:val="24"/>
+      <w:szCs w:val="28"/>
+    </w:rPr>
+  </w:style>
+  <w:style w:type="paragraph" w:customStyle="1" w:styleId="TMLTitulo3">
+    <w:name w:val="TML Titulo 3"/>
+    <w:basedOn w:val="TMLBase"/>
+    <w:next w:val="TMLCorpo"/>
+    <w:qFormat/>
+    <w:pPr>
+      <w:keepNext/>
+      <w:keepLines/>
+      <w:numPr>
+        <w:ilvl w:val="2"/>
+        <w:numId w:val="5"/>
+      </w:numPr>
+      <w:spacing w:before="200" w:after="80"/>
+      <w:ind w:left="567" w:hanging="567"/>
+      <w:outlineLvl w:val="2"/>
+    </w:pPr>
+    <w:rPr>
+      <w:rFonts w:ascii="Greycliff CF" w:hAnsi="Greycliff CF" w:cs="Greycliff CF"/>
+      <w:b/>
+      <w:bCs/>
+      <w:color w:val="000000"/>
       <w:sz w:val="22"/>
       <w:szCs w:val="22"/>
     </w:rPr>
   </w:style>
   <w:style w:type="paragraph" w:styleId="Title">
     <w:name w:val="Title"/>
-    <w:basedOn w:val="Ttulo"/>
-    <w:next w:val="Normal"/>
+    <w:basedOn w:val="TMLBase"/>
+    <w:next w:val="TMLCorpo"/>
     <w:qFormat/>
     <w:pPr>
       <w:jc w:val="right"/>
     </w:pPr>
     <w:rPr>
-      <w:rFonts w:ascii="Greycliff CF" w:hAnsi="Greycliff CF"/>
+      <w:rFonts w:ascii="Greycliff CF" w:hAnsi="Greycliff CF" w:cs="Greycliff CF"/>
+      <w:color w:val="000000"/>
       <w:sz w:val="24"/>
       <w:szCs w:val="24"/>
       <w:lang w:val="pt-PT"/>
@@ -10405,11 +10782,13 @@
     </w:pPr>
     <w:rPr>
       <w:rFonts w:ascii="Calibri" w:hAnsi="Calibri" w:cs="Calibri"/>
+      <w:color w:val="000000"/>
       <w:sz w:val="17"/>
       <w:szCs w:val="17"/>
       <w:lang w:val="pt-PT"/>
     </w:rPr>
     <w:tblPr>
+      <w:jc w:val="center"/>
       <w:tblBorders>
         <w:top w:val="single" w:sz="8" w:space="0" w:color="000000"/>
         <w:bottom w:val="single" w:sz="8" w:space="0" w:color="000000"/>
@@ -10427,6 +10806,7 @@
         <w:rFonts w:ascii="Calibri" w:hAnsi="Calibri" w:cs="Calibri"/>
         <w:b/>
         <w:bCs/>
+        <w:color w:val="000000"/>
         <w:sz w:val="17"/>
         <w:szCs w:val="17"/>
       </w:rPr>
@@ -10451,7 +10831,7 @@
   </w:style>
   <w:style w:type="paragraph" w:customStyle="1" w:styleId="SourceCode">
     <w:name w:val="Source Code"/>
-    <w:basedOn w:val="Normal"/>
+    <w:basedOn w:val="TMLBase"/>
     <w:qFormat/>
     <w:pPr>
       <w:spacing w:before="60" w:after="60" w:line="240" w:lineRule="auto"/>

</xml_diff>